<commit_message>
refactor: separar y corregir plantillas de anexos
</commit_message>
<xml_diff>
--- a/templates/ANEXO03_template.docx
+++ b/templates/ANEXO03_template.docx
@@ -216,12 +216,20 @@
               </w:tabs>
               <w:spacing w:line="276" w:lineRule="auto"/>
               <w:ind w:left="708" w:hanging="708"/>
+              <w:jc w:val="center"/>
               <w:rPr>
                 <w:sz w:val="18"/>
                 <w:szCs w:val="18"/>
                 <w:lang w:val="es-PE"/>
               </w:rPr>
             </w:pPr>
+            <w:r>
+              <w:rPr>
+                <w:b/>
+                <w:sz w:val="20"/>
+              </w:rPr>
+              <w:t>{fechaSolicitud}</w:t>
+            </w:r>
           </w:p>
         </w:tc>
       </w:tr>
@@ -540,7 +548,7 @@
           <w:b/>
           <w:sz w:val="20"/>
         </w:rPr>
-        <w:t>FECHA DE SOLICITUD:{fechaSolicitud}</w:t>
+        <w:t>FECHA DE SOLICITUD: {fechaSolicitud}</w:t>
       </w:r>
     </w:p>
     <w:p>
@@ -556,28 +564,25 @@
           <w:b/>
           <w:sz w:val="20"/>
         </w:rPr>
-        <w:t xml:space="preserve">                                                                                                                     </w:t>
+        <w:t>FECHA DE TERMINO: {fechaTermino}</w:t>
       </w:r>
       <w:r>
         <w:rPr>
           <w:b/>
           <w:sz w:val="20"/>
         </w:rPr>
-        <w:t xml:space="preserve">FECHA DE </w:t>
       </w:r>
       <w:r>
         <w:rPr>
           <w:b/>
           <w:sz w:val="20"/>
         </w:rPr>
-        <w:t>TERMINO</w:t>
       </w:r>
       <w:r>
         <w:rPr>
           <w:b/>
           <w:sz w:val="20"/>
         </w:rPr>
-        <w:t>:{fechaTermino}</w:t>
       </w:r>
     </w:p>
     <w:p/>
@@ -598,47 +603,47 @@
         <w:rPr>
           <w:b/>
         </w:rPr>
-        <w:t>1.- AREA:{area}</w:t>
-      </w:r>
-    </w:p>
-    <w:p>
-      <w:pPr>
-        <w:rPr>
-          <w:b/>
-        </w:rPr>
-      </w:pPr>
-    </w:p>
-    <w:p>
-      <w:pPr>
-        <w:rPr>
-          <w:b/>
-        </w:rPr>
-      </w:pPr>
-      <w:r>
-        <w:rPr>
-          <w:b/>
-        </w:rPr>
-        <w:t>2. JEFE DE AREA:{jefeArea}</w:t>
-      </w:r>
-    </w:p>
-    <w:p>
-      <w:pPr>
-        <w:rPr>
-          <w:b/>
-        </w:rPr>
-      </w:pPr>
-    </w:p>
-    <w:p>
-      <w:pPr>
-        <w:rPr>
-          <w:b/>
-        </w:rPr>
-      </w:pPr>
-      <w:r>
-        <w:rPr>
-          <w:b/>
-        </w:rPr>
-        <w:t>3. USUARIO SOLICITANTE:{usuarioSolicitante}</w:t>
+        <w:t>1.- AREA: {area}</w:t>
+      </w:r>
+    </w:p>
+    <w:p>
+      <w:pPr>
+        <w:rPr>
+          <w:b/>
+        </w:rPr>
+      </w:pPr>
+    </w:p>
+    <w:p>
+      <w:pPr>
+        <w:rPr>
+          <w:b/>
+        </w:rPr>
+      </w:pPr>
+      <w:r>
+        <w:rPr>
+          <w:b/>
+        </w:rPr>
+        <w:t>2. JEFE DE AREA: {jefeArea}</w:t>
+      </w:r>
+    </w:p>
+    <w:p>
+      <w:pPr>
+        <w:rPr>
+          <w:b/>
+        </w:rPr>
+      </w:pPr>
+    </w:p>
+    <w:p>
+      <w:pPr>
+        <w:rPr>
+          <w:b/>
+        </w:rPr>
+      </w:pPr>
+      <w:r>
+        <w:rPr>
+          <w:b/>
+        </w:rPr>
+        <w:t>3. USUARIO SOLICITANTE: {usuarioSolicitante}</w:t>
       </w:r>
     </w:p>
     <w:p>
@@ -895,85 +900,148 @@
         <w:tc>
           <w:tcPr>
             <w:tcW w:w="992" w:type="dxa"/>
-          </w:tcPr>
-          <w:p>
-            <w:pPr>
-              <w:rPr>
-                <w:b/>
-              </w:rPr>
-            </w:pPr>
+            <w:vAlign w:val="center"/>
+          </w:tcPr>
+          <w:p>
+            <w:pPr>
+              <w:jc w:val="center"/>
+              <w:rPr>
+                <w:b/>
+              </w:rPr>
+            </w:pPr>
+            <w:r>
+              <w:rPr>
+                <w:b w:val="0"/>
+                <w:sz w:val="16"/>
+              </w:rPr>
+              <w:t>{#usuarios}{area}</w:t>
+            </w:r>
           </w:p>
         </w:tc>
         <w:tc>
           <w:tcPr>
             <w:tcW w:w="1271" w:type="dxa"/>
-          </w:tcPr>
-          <w:p>
-            <w:pPr>
-              <w:rPr>
-                <w:b/>
-              </w:rPr>
-            </w:pPr>
+            <w:vAlign w:val="center"/>
+          </w:tcPr>
+          <w:p>
+            <w:pPr>
+              <w:jc w:val="center"/>
+              <w:rPr>
+                <w:b/>
+              </w:rPr>
+            </w:pPr>
+            <w:r>
+              <w:rPr>
+                <w:b w:val="0"/>
+                <w:sz w:val="16"/>
+              </w:rPr>
+              <w:t>{proyecto}</w:t>
+            </w:r>
           </w:p>
         </w:tc>
         <w:tc>
           <w:tcPr>
             <w:tcW w:w="993" w:type="dxa"/>
-          </w:tcPr>
-          <w:p>
-            <w:pPr>
-              <w:rPr>
-                <w:b/>
-              </w:rPr>
-            </w:pPr>
+            <w:vAlign w:val="center"/>
+          </w:tcPr>
+          <w:p>
+            <w:pPr>
+              <w:jc w:val="center"/>
+              <w:rPr>
+                <w:b/>
+              </w:rPr>
+            </w:pPr>
+            <w:r>
+              <w:rPr>
+                <w:b w:val="0"/>
+                <w:sz w:val="16"/>
+              </w:rPr>
+              <w:t>{dni}</w:t>
+            </w:r>
           </w:p>
         </w:tc>
         <w:tc>
           <w:tcPr>
             <w:tcW w:w="1559" w:type="dxa"/>
-          </w:tcPr>
-          <w:p>
-            <w:pPr>
-              <w:rPr>
-                <w:b/>
-              </w:rPr>
-            </w:pPr>
+            <w:vAlign w:val="center"/>
+          </w:tcPr>
+          <w:p>
+            <w:pPr>
+              <w:jc w:val="center"/>
+              <w:rPr>
+                <w:b/>
+              </w:rPr>
+            </w:pPr>
+            <w:r>
+              <w:rPr>
+                <w:b w:val="0"/>
+                <w:sz w:val="16"/>
+              </w:rPr>
+              <w:t>{nombre}</w:t>
+            </w:r>
           </w:p>
         </w:tc>
         <w:tc>
           <w:tcPr>
             <w:tcW w:w="1934" w:type="dxa"/>
-          </w:tcPr>
-          <w:p>
-            <w:pPr>
-              <w:rPr>
-                <w:b/>
-              </w:rPr>
-            </w:pPr>
+            <w:vAlign w:val="center"/>
+          </w:tcPr>
+          <w:p>
+            <w:pPr>
+              <w:jc w:val="center"/>
+              <w:rPr>
+                <w:b/>
+              </w:rPr>
+            </w:pPr>
+            <w:r>
+              <w:rPr>
+                <w:b w:val="0"/>
+                <w:sz w:val="16"/>
+              </w:rPr>
+              <w:t>{apellidos}</w:t>
+            </w:r>
           </w:p>
         </w:tc>
         <w:tc>
           <w:tcPr>
             <w:tcW w:w="1043" w:type="dxa"/>
-          </w:tcPr>
-          <w:p>
-            <w:pPr>
-              <w:rPr>
-                <w:b/>
-              </w:rPr>
-            </w:pPr>
+            <w:vAlign w:val="center"/>
+          </w:tcPr>
+          <w:p>
+            <w:pPr>
+              <w:jc w:val="center"/>
+              <w:rPr>
+                <w:b/>
+              </w:rPr>
+            </w:pPr>
+            <w:r>
+              <w:rPr>
+                <w:b w:val="0"/>
+                <w:sz w:val="16"/>
+              </w:rPr>
+              <w:t>{lectura}</w:t>
+            </w:r>
           </w:p>
         </w:tc>
         <w:tc>
           <w:tcPr>
             <w:tcW w:w="1308" w:type="dxa"/>
-          </w:tcPr>
-          <w:p>
-            <w:pPr>
-              <w:rPr>
-                <w:b/>
-              </w:rPr>
-            </w:pPr>
+            <w:vAlign w:val="center"/>
+          </w:tcPr>
+          <w:p>
+            <w:pPr>
+              <w:jc w:val="center"/>
+              <w:rPr>
+                <w:b/>
+              </w:rPr>
+            </w:pPr>
+            <w:r>
+              <w:rPr>
+                <w:b w:val="0"/>
+                <w:sz w:val="16"/>
+              </w:rPr>
+              <w:t>{escritura}{/usuarios}</w:t>
+            </w:r>
           </w:p>
         </w:tc>
       </w:tr>
@@ -1603,15 +1671,19 @@
     </w:p>
     <w:p>
       <w:pPr>
-        <w:rPr>
-          <w:b/>
-        </w:rPr>
-      </w:pPr>
-      <w:r>
-        <w:rPr>
-          <w:b/>
+        <w:jc w:val="center"/>
+        <w:rPr>
+          <w:b/>
+        </w:rPr>
+      </w:pPr>
+      <w:r>
+        <w:rPr>
+          <w:b w:val="0"/>
+          <w:sz w:val="20"/>
         </w:rPr>
         <w:t>…….……………………………………                                                                  …….……………………………………</w:t>
+        <w:br/>
+        <w:t>{jefeArea}                                                                  {usuarioSolicitante}</w:t>
       </w:r>
     </w:p>
     <w:p>

</xml_diff>